<commit_message>
Struggling-user flag, remove capacity/bid-limit defaults, gate flash fix, workflow confirmations, APPROVED/DENIED history
</commit_message>
<xml_diff>
--- a/Vacation-Auction-Rules-and-System-Reference.docx
+++ b/Vacation-Auction-Rules-and-System-Reference.docx
@@ -39,7 +39,7 @@
           <w:sz w:val="18"/>
           <w:szCs w:val="18"/>
         </w:rPr>
-        <w:t xml:space="preserve">Prepared 16 July 2026 · Reflects user site build 52, admin site build 66 · Verified against the live code by four independent AI auditors and 410 automated tests</w:t>
+        <w:t xml:space="preserve">Prepared 16 July 2026 · Reflects user site build 53, admin site build 68 · Verified against the live code by four independent AI auditors and 421 automated tests</w:t>
       </w:r>
     </w:p>
     <w:p>
@@ -64,7 +64,7 @@
         <w:spacing w:after="120" w:line="276"/>
       </w:pPr>
       <w:r>
-        <w:t xml:space="preserve">The year is divided into 52 selectable weeks. Each week has an FTE capacity ("cap", default 3.0; high-demand weeks 5.0; summer weeks 4.0 — all editable per week in FTE Availability). Each user consumes their personal FTE value (0–1.0) from a week’s cap when they win it.</w:t>
+        <w:t xml:space="preserve">The year is divided into 52 selectable weeks. Each week’s FTE capacity comes ONLY from what you save in FTE Availability — there are no built-in defaults, so a capacity can never silently revert. A week without a saved value has capacity 0 and is unbiddable; the dashboard’s NEXT STEP box flags any such weeks until you save them (the panel pre-fills suggested values: 3.0 typical, 4.0 summer, 5.0 high-demand). Each user consumes their personal FTE value (0–1.0) from a week’s cap when they win it.</w:t>
       </w:r>
     </w:p>
     <w:p>
@@ -121,7 +121,7 @@
         <w:spacing w:after="80" w:line="276"/>
       </w:pPr>
       <w:r>
-        <w:t xml:space="preserve">Per-phase bid limit (admin-set, default 3, can be "none"): counts every bid placed this phase — including bids you have secretly denied — so a denied user cannot quietly place extras. Edits and removals are always allowed; only new bids are blocked at the limit.</w:t>
+        <w:t xml:space="preserve">Per-phase bid limit: only what admin enters counts — nothing saved means no limit. The count includes bids denied by admin (which users can’t yet see), so a denial never hands a user extra bids. Edits and removals are always allowed; only new bids are blocked at the limit.</w:t>
       </w:r>
     </w:p>
     <w:p>
@@ -221,7 +221,7 @@
         <w:spacing w:after="80" w:line="276"/>
       </w:pPr>
       <w:r>
-        <w:t xml:space="preserve">"View previous phases" shows each finished phase’s bids and final results (WON / DENIED / LOST) — but a completed phase stays hidden until you begin the next one.</w:t>
+        <w:t xml:space="preserve">"View previous phases" shows each finished phase’s bids with their final results — APPROVED or DENIED, matching the admin vocabulary — but a completed phase stays hidden until you begin the next one.</w:t>
       </w:r>
     </w:p>
     <w:p>
@@ -853,7 +853,7 @@
         <w:spacing w:after="120" w:line="276"/>
       </w:pPr>
       <w:r>
-        <w:t xml:space="preserve">The dashboard’s Current Phase card always shows a NEXT STEP box with one button for the next action, in this fixed rhythm: Begin Phase → bidding open → Close bidding (expires the timer and locks all 52 weeks) → decide every remaining bid → Complete Phase → Send results e-mails → Begin next phase. Guard rails along the way: beginning any phase resets the timer to a fresh 48 hours and forces a lock decision (Smart Lock &amp; Unlock or explicit override); a phase cannot complete while any current-phase bid is undecided; completing auto-locks all weeks, snapshots everything, zeroes the activity counters, and immediately offers to send results; beginning the next phase warns with a send button if results were never e-mailed; sliding the timer to 0 expires it (and locks all weeks) rather than disabling it; Reset Auction requires two confirmations and typing RESET.</w:t>
+        <w:t xml:space="preserve">The dashboard’s Current Phase card always shows a NEXT STEP box with one button for the next action, in this fixed rhythm: Begin Phase → bidding open → Close bidding (expires the timer and locks all 52 weeks) → decide every remaining bid → Complete Phase → Send results e-mails → Begin next phase. Every step confirms before acting. Guard rails along the way: beginning any phase resets the timer to a fresh 48 hours and forces a lock decision (Smart Lock &amp; Unlock or explicit override); a phase cannot complete while any current-phase bid is undecided; completing auto-locks all weeks, snapshots everything, zeroes the activity counters, and immediately offers to send results; beginning the next phase warns with a send button if results were never e-mailed; sliding the timer to 0 expires it (and locks all weeks) rather than disabling it; Reset Auction requires two confirmations and typing RESET.</w:t>
       </w:r>
     </w:p>
     <w:p>
@@ -888,7 +888,7 @@
         <w:spacing w:after="80" w:line="276"/>
       </w:pPr>
       <w:r>
-        <w:t xml:space="preserve">Auction Insights: a bid-activity timeline (changes per interval since the phase opened) and the Popcornometer.</w:t>
+        <w:t xml:space="preserve">Auction Insights: a bid-activity timeline (changes per interval since the phase opened), a struggling-user flag (users with no wins who are losing — red when their remaining bid numbers can’t beat or tie any week they want, orange when they could still improve), and the Popcornometer.</w:t>
       </w:r>
     </w:p>
     <w:p>

</xml_diff>